<commit_message>
Update PRISMA-ScR-Fillable-Checklist documents: replace DOCX and PDF files with revised versions.
</commit_message>
<xml_diff>
--- a/PRISMA-ScR-Fillable-Checklist.docx
+++ b/PRISMA-ScR-Fillable-Checklist.docx
@@ -1,6 +1,6 @@
 
 <file path=word/document.xml><?xml version="1.0" encoding="utf-8"?>
-<w:document xmlns:wpc="http://schemas.microsoft.com/office/word/2010/wordprocessingCanvas" xmlns:cx="http://schemas.microsoft.com/office/drawing/2014/chartex" xmlns:cx1="http://schemas.microsoft.com/office/drawing/2015/9/8/chartex" xmlns:cx2="http://schemas.microsoft.com/office/drawing/2015/10/21/chartex" xmlns:cx3="http://schemas.microsoft.com/office/drawing/2016/5/9/chartex" xmlns:cx4="http://schemas.microsoft.com/office/drawing/2016/5/10/chartex" xmlns:cx5="http://schemas.microsoft.com/office/drawing/2016/5/11/chartex" xmlns:cx6="http://schemas.microsoft.com/office/drawing/2016/5/12/chartex" xmlns:cx7="http://schemas.microsoft.com/office/drawing/2016/5/13/chartex" xmlns:cx8="http://schemas.microsoft.com/office/drawing/2016/5/14/chartex" xmlns:mc="http://schemas.openxmlformats.org/markup-compatibility/2006" xmlns:aink="http://schemas.microsoft.com/office/drawing/2016/ink" xmlns:am3d="http://schemas.microsoft.com/office/drawing/2017/model3d" xmlns:o="urn:schemas-microsoft-com:office:office" xmlns:oel="http://schemas.microsoft.com/office/2019/extlst" xmlns:r="http://schemas.openxmlformats.org/officeDocument/2006/relationships" xmlns:m="http://schemas.openxmlformats.org/officeDocument/2006/math" xmlns:v="urn:schemas-microsoft-com:vml" xmlns:wp14="http://schemas.microsoft.com/office/word/2010/wordprocessingDrawing" xmlns:wp="http://schemas.openxmlformats.org/drawingml/2006/wordprocessingDrawing" xmlns:w10="urn:schemas-microsoft-com:office:word" xmlns:w="http://schemas.openxmlformats.org/wordprocessingml/2006/main" xmlns:w14="http://schemas.microsoft.com/office/word/2010/wordml" xmlns:w15="http://schemas.microsoft.com/office/word/2012/wordml" xmlns:w16cex="http://schemas.microsoft.com/office/word/2018/wordml/cex" xmlns:w16cid="http://schemas.microsoft.com/office/word/2016/wordml/cid" xmlns:w16="http://schemas.microsoft.com/office/word/2018/wordml" xmlns:w16du="http://schemas.microsoft.com/office/word/2023/wordml/word16du" xmlns:w16sdtdh="http://schemas.microsoft.com/office/word/2020/wordml/sdtdatahash" xmlns:w16se="http://schemas.microsoft.com/office/word/2015/wordml/symex" xmlns:wpg="http://schemas.microsoft.com/office/word/2010/wordprocessingGroup" xmlns:wpi="http://schemas.microsoft.com/office/word/2010/wordprocessingInk" xmlns:wne="http://schemas.microsoft.com/office/word/2006/wordml" xmlns:wps="http://schemas.microsoft.com/office/word/2010/wordprocessingShape" mc:Ignorable="w14 w15 w16se w16cid w16 w16cex w16sdtdh w16du wp14">
+<w:document xmlns:wpc="http://schemas.microsoft.com/office/word/2010/wordprocessingCanvas" xmlns:cx="http://schemas.microsoft.com/office/drawing/2014/chartex" xmlns:cx1="http://schemas.microsoft.com/office/drawing/2015/9/8/chartex" xmlns:cx2="http://schemas.microsoft.com/office/drawing/2015/10/21/chartex" xmlns:cx3="http://schemas.microsoft.com/office/drawing/2016/5/9/chartex" xmlns:cx4="http://schemas.microsoft.com/office/drawing/2016/5/10/chartex" xmlns:cx5="http://schemas.microsoft.com/office/drawing/2016/5/11/chartex" xmlns:cx6="http://schemas.microsoft.com/office/drawing/2016/5/12/chartex" xmlns:cx7="http://schemas.microsoft.com/office/drawing/2016/5/13/chartex" xmlns:cx8="http://schemas.microsoft.com/office/drawing/2016/5/14/chartex" xmlns:mc="http://schemas.openxmlformats.org/markup-compatibility/2006" xmlns:aink="http://schemas.microsoft.com/office/drawing/2016/ink" xmlns:am3d="http://schemas.microsoft.com/office/drawing/2017/model3d" xmlns:o="urn:schemas-microsoft-com:office:office" xmlns:r="http://schemas.openxmlformats.org/officeDocument/2006/relationships" xmlns:m="http://schemas.openxmlformats.org/officeDocument/2006/math" xmlns:v="urn:schemas-microsoft-com:vml" xmlns:wp14="http://schemas.microsoft.com/office/word/2010/wordprocessingDrawing" xmlns:wp="http://schemas.openxmlformats.org/drawingml/2006/wordprocessingDrawing" xmlns:w10="urn:schemas-microsoft-com:office:word" xmlns:w="http://schemas.openxmlformats.org/wordprocessingml/2006/main" xmlns:w14="http://schemas.microsoft.com/office/word/2010/wordml" xmlns:w15="http://schemas.microsoft.com/office/word/2012/wordml" xmlns:w16cex="http://schemas.microsoft.com/office/word/2018/wordml/cex" xmlns:w16cid="http://schemas.microsoft.com/office/word/2016/wordml/cid" xmlns:w16="http://schemas.microsoft.com/office/word/2018/wordml" xmlns:w16sdtdh="http://schemas.microsoft.com/office/word/2020/wordml/sdtdatahash" xmlns:w16se="http://schemas.microsoft.com/office/word/2015/wordml/symex" xmlns:wpg="http://schemas.microsoft.com/office/word/2010/wordprocessingGroup" xmlns:wpi="http://schemas.microsoft.com/office/word/2010/wordprocessingInk" xmlns:wne="http://schemas.microsoft.com/office/word/2006/wordml" xmlns:wps="http://schemas.microsoft.com/office/word/2010/wordprocessingShape" mc:Ignorable="w14 w15 w16se w16cid w16 w16cex w16sdtdh wp14">
   <w:body>
     <w:p>
       <w:pPr>
@@ -31,27 +31,7 @@
           <w:bCs/>
           <w:szCs w:val="20"/>
         </w:rPr>
-        <w:t>s extension for Scoping Reviews (PRISMA-</w:t>
-      </w:r>
-      <w:proofErr w:type="spellStart"/>
-      <w:r>
-        <w:rPr>
-          <w:rFonts w:ascii="Arial" w:eastAsiaTheme="majorEastAsia" w:hAnsi="Arial" w:cs="Arial"/>
-          <w:b/>
-          <w:bCs/>
-          <w:szCs w:val="20"/>
-        </w:rPr>
-        <w:t>ScR</w:t>
-      </w:r>
-      <w:proofErr w:type="spellEnd"/>
-      <w:r>
-        <w:rPr>
-          <w:rFonts w:ascii="Arial" w:eastAsiaTheme="majorEastAsia" w:hAnsi="Arial" w:cs="Arial"/>
-          <w:b/>
-          <w:bCs/>
-          <w:szCs w:val="20"/>
-        </w:rPr>
-        <w:t>) Checklist</w:t>
+        <w:t>s extension for Scoping Reviews (PRISMA-ScR) Checklist</w:t>
       </w:r>
     </w:p>
     <w:tbl>
@@ -156,9 +136,8 @@
                 <w:sz w:val="20"/>
                 <w:szCs w:val="20"/>
               </w:rPr>
-              <w:t>PRISMA-</w:t>
-            </w:r>
-            <w:proofErr w:type="spellStart"/>
+              <w:t>PRISMA-Sc</w:t>
+            </w:r>
             <w:r>
               <w:rPr>
                 <w:rFonts w:ascii="Arial" w:hAnsi="Arial" w:cs="Arial"/>
@@ -167,28 +146,7 @@
                 <w:sz w:val="20"/>
                 <w:szCs w:val="20"/>
               </w:rPr>
-              <w:t>Sc</w:t>
-            </w:r>
-            <w:r>
-              <w:rPr>
-                <w:rFonts w:ascii="Arial" w:hAnsi="Arial" w:cs="Arial"/>
-                <w:b/>
-                <w:color w:val="F2F2F2" w:themeColor="background1" w:themeShade="F2"/>
-                <w:sz w:val="20"/>
-                <w:szCs w:val="20"/>
-              </w:rPr>
-              <w:t>R</w:t>
-            </w:r>
-            <w:proofErr w:type="spellEnd"/>
-            <w:r>
-              <w:rPr>
-                <w:rFonts w:ascii="Arial" w:hAnsi="Arial" w:cs="Arial"/>
-                <w:b/>
-                <w:color w:val="F2F2F2" w:themeColor="background1" w:themeShade="F2"/>
-                <w:sz w:val="20"/>
-                <w:szCs w:val="20"/>
-              </w:rPr>
-              <w:t xml:space="preserve"> CHECKLIST ITEM</w:t>
+              <w:t>R CHECKLIST ITEM</w:t>
             </w:r>
           </w:p>
         </w:tc>
@@ -718,7 +676,7 @@
                     <w:sz w:val="20"/>
                     <w:szCs w:val="20"/>
                   </w:rPr>
-                  <w:t>5</w:t>
+                  <w:t>4</w:t>
                 </w:r>
               </w:p>
             </w:tc>
@@ -834,7 +792,23 @@
                     <w:sz w:val="20"/>
                     <w:szCs w:val="20"/>
                   </w:rPr>
-                  <w:t>6-7</w:t>
+                  <w:t>5</w:t>
+                </w:r>
+                <w:r>
+                  <w:rPr>
+                    <w:rFonts w:ascii="Arial" w:hAnsi="Arial" w:cs="Arial"/>
+                    <w:sz w:val="20"/>
+                    <w:szCs w:val="20"/>
+                  </w:rPr>
+                  <w:t>-</w:t>
+                </w:r>
+                <w:r>
+                  <w:rPr>
+                    <w:rFonts w:ascii="Arial" w:hAnsi="Arial" w:cs="Arial"/>
+                    <w:sz w:val="20"/>
+                    <w:szCs w:val="20"/>
+                  </w:rPr>
+                  <w:t>6</w:t>
                 </w:r>
               </w:p>
             </w:tc>
@@ -1137,7 +1111,7 @@
                     <w:sz w:val="20"/>
                     <w:szCs w:val="20"/>
                   </w:rPr>
-                  <w:t>8</w:t>
+                  <w:t>7</w:t>
                 </w:r>
               </w:p>
             </w:tc>
@@ -1277,7 +1251,7 @@
                     <w:sz w:val="20"/>
                     <w:szCs w:val="20"/>
                   </w:rPr>
-                  <w:t>8</w:t>
+                  <w:t>7</w:t>
                 </w:r>
               </w:p>
             </w:tc>
@@ -1390,7 +1364,7 @@
                     <w:sz w:val="20"/>
                     <w:szCs w:val="20"/>
                   </w:rPr>
-                  <w:t>8</w:t>
+                  <w:t>7</w:t>
                 </w:r>
               </w:p>
             </w:tc>
@@ -1511,7 +1485,7 @@
                     <w:sz w:val="20"/>
                     <w:szCs w:val="20"/>
                   </w:rPr>
-                  <w:t>8</w:t>
+                  <w:t>7</w:t>
                 </w:r>
               </w:p>
             </w:tc>
@@ -1680,7 +1654,7 @@
                     <w:sz w:val="20"/>
                     <w:szCs w:val="20"/>
                   </w:rPr>
-                  <w:t>8</w:t>
+                  <w:t>7</w:t>
                 </w:r>
               </w:p>
             </w:tc>
@@ -1796,7 +1770,7 @@
                     <w:sz w:val="20"/>
                     <w:szCs w:val="20"/>
                   </w:rPr>
-                  <w:t>8-9</w:t>
+                  <w:t>8</w:t>
                 </w:r>
               </w:p>
             </w:tc>
@@ -2030,7 +2004,23 @@
                     <w:sz w:val="20"/>
                     <w:szCs w:val="20"/>
                   </w:rPr>
-                  <w:t>8-9</w:t>
+                  <w:t>25</w:t>
+                </w:r>
+                <w:r>
+                  <w:rPr>
+                    <w:rFonts w:ascii="Arial" w:hAnsi="Arial" w:cs="Arial"/>
+                    <w:sz w:val="20"/>
+                    <w:szCs w:val="20"/>
+                  </w:rPr>
+                  <w:t>-</w:t>
+                </w:r>
+                <w:r>
+                  <w:rPr>
+                    <w:rFonts w:ascii="Arial" w:hAnsi="Arial" w:cs="Arial"/>
+                    <w:sz w:val="20"/>
+                    <w:szCs w:val="20"/>
+                  </w:rPr>
+                  <w:t>27</w:t>
                 </w:r>
               </w:p>
             </w:tc>
@@ -2173,7 +2163,7 @@
                     <w:sz w:val="20"/>
                     <w:szCs w:val="20"/>
                   </w:rPr>
-                  <w:t>9</w:t>
+                  <w:t>6</w:t>
                 </w:r>
               </w:p>
             </w:tc>
@@ -2286,15 +2276,7 @@
                     <w:sz w:val="20"/>
                     <w:szCs w:val="20"/>
                   </w:rPr>
-                  <w:t xml:space="preserve">7 and </w:t>
-                </w:r>
-                <w:r>
-                  <w:rPr>
-                    <w:rFonts w:ascii="Arial" w:hAnsi="Arial" w:cs="Arial"/>
-                    <w:sz w:val="20"/>
-                    <w:szCs w:val="20"/>
-                  </w:rPr>
-                  <w:t>9</w:t>
+                  <w:t>8</w:t>
                 </w:r>
               </w:p>
             </w:tc>
@@ -2407,7 +2389,7 @@
                     <w:sz w:val="20"/>
                     <w:szCs w:val="20"/>
                   </w:rPr>
-                  <w:t>9</w:t>
+                  <w:t>25-27</w:t>
                 </w:r>
               </w:p>
             </w:tc>
@@ -2543,7 +2525,39 @@
                     <w:sz w:val="20"/>
                     <w:szCs w:val="20"/>
                   </w:rPr>
-                  <w:t>7, 21 and 24</w:t>
+                  <w:t>8</w:t>
+                </w:r>
+                <w:r>
+                  <w:rPr>
+                    <w:rFonts w:ascii="Arial" w:hAnsi="Arial" w:cs="Arial"/>
+                    <w:sz w:val="20"/>
+                    <w:szCs w:val="20"/>
+                  </w:rPr>
+                  <w:t xml:space="preserve">, </w:t>
+                </w:r>
+                <w:r>
+                  <w:rPr>
+                    <w:rFonts w:ascii="Arial" w:hAnsi="Arial" w:cs="Arial"/>
+                    <w:sz w:val="20"/>
+                    <w:szCs w:val="20"/>
+                  </w:rPr>
+                  <w:t>18</w:t>
+                </w:r>
+                <w:r>
+                  <w:rPr>
+                    <w:rFonts w:ascii="Arial" w:hAnsi="Arial" w:cs="Arial"/>
+                    <w:sz w:val="20"/>
+                    <w:szCs w:val="20"/>
+                  </w:rPr>
+                  <w:t xml:space="preserve"> and 2</w:t>
+                </w:r>
+                <w:r>
+                  <w:rPr>
+                    <w:rFonts w:ascii="Arial" w:hAnsi="Arial" w:cs="Arial"/>
+                    <w:sz w:val="20"/>
+                    <w:szCs w:val="20"/>
+                  </w:rPr>
+                  <w:t>1</w:t>
                 </w:r>
               </w:p>
             </w:tc>
@@ -2656,7 +2670,7 @@
                     <w:sz w:val="20"/>
                     <w:szCs w:val="20"/>
                   </w:rPr>
-                  <w:t>9</w:t>
+                  <w:t>8</w:t>
                 </w:r>
               </w:p>
             </w:tc>
@@ -2814,7 +2828,15 @@
                     <w:sz w:val="20"/>
                     <w:szCs w:val="20"/>
                   </w:rPr>
-                  <w:t>9-25</w:t>
+                  <w:t>25</w:t>
+                </w:r>
+                <w:r>
+                  <w:rPr>
+                    <w:rFonts w:ascii="Arial" w:hAnsi="Arial" w:cs="Arial"/>
+                    <w:sz w:val="20"/>
+                    <w:szCs w:val="20"/>
+                  </w:rPr>
+                  <w:t>-27</w:t>
                 </w:r>
               </w:p>
             </w:tc>
@@ -2929,7 +2951,23 @@
                     <w:sz w:val="20"/>
                     <w:szCs w:val="20"/>
                   </w:rPr>
-                  <w:t>25</w:t>
+                  <w:t>27-</w:t>
+                </w:r>
+                <w:r>
+                  <w:rPr>
+                    <w:rFonts w:ascii="Arial" w:hAnsi="Arial" w:cs="Arial"/>
+                    <w:sz w:val="20"/>
+                    <w:szCs w:val="20"/>
+                  </w:rPr>
+                  <w:t>2</w:t>
+                </w:r>
+                <w:r>
+                  <w:rPr>
+                    <w:rFonts w:ascii="Arial" w:hAnsi="Arial" w:cs="Arial"/>
+                    <w:sz w:val="20"/>
+                    <w:szCs w:val="20"/>
+                  </w:rPr>
+                  <w:t>8</w:t>
                 </w:r>
               </w:p>
             </w:tc>
@@ -3042,7 +3080,15 @@
                     <w:sz w:val="20"/>
                     <w:szCs w:val="20"/>
                   </w:rPr>
-                  <w:t>25-26</w:t>
+                  <w:t>2</w:t>
+                </w:r>
+                <w:r>
+                  <w:rPr>
+                    <w:rFonts w:ascii="Arial" w:hAnsi="Arial" w:cs="Arial"/>
+                    <w:sz w:val="20"/>
+                    <w:szCs w:val="20"/>
+                  </w:rPr>
+                  <w:t>8</w:t>
                 </w:r>
               </w:p>
             </w:tc>
@@ -3184,7 +3230,15 @@
                     <w:sz w:val="20"/>
                     <w:szCs w:val="20"/>
                   </w:rPr>
-                  <w:t>26</w:t>
+                  <w:t>2</w:t>
+                </w:r>
+                <w:r>
+                  <w:rPr>
+                    <w:rFonts w:ascii="Arial" w:hAnsi="Arial" w:cs="Arial"/>
+                    <w:sz w:val="20"/>
+                    <w:szCs w:val="20"/>
+                  </w:rPr>
+                  <w:t>9</w:t>
                 </w:r>
               </w:p>
             </w:tc>
@@ -3207,25 +3261,7 @@
           <w:sz w:val="18"/>
           <w:szCs w:val="20"/>
         </w:rPr>
-        <w:t>JBI = Joanna Briggs Institute; PRISMA-</w:t>
-      </w:r>
-      <w:proofErr w:type="spellStart"/>
-      <w:r>
-        <w:rPr>
-          <w:rFonts w:ascii="Arial" w:hAnsi="Arial" w:cs="Arial"/>
-          <w:sz w:val="18"/>
-          <w:szCs w:val="20"/>
-        </w:rPr>
-        <w:t>ScR</w:t>
-      </w:r>
-      <w:proofErr w:type="spellEnd"/>
-      <w:r>
-        <w:rPr>
-          <w:rFonts w:ascii="Arial" w:hAnsi="Arial" w:cs="Arial"/>
-          <w:sz w:val="18"/>
-          <w:szCs w:val="20"/>
-        </w:rPr>
-        <w:t xml:space="preserve"> = Preferred Reporting Items for Systematic reviews and Meta-Analyses extension for Scoping Reviews.</w:t>
+        <w:t>JBI = Joanna Briggs Institute; PRISMA-ScR = Preferred Reporting Items for Systematic reviews and Meta-Analyses extension for Scoping Reviews.</w:t>
       </w:r>
     </w:p>
     <w:p>
@@ -3416,39 +3452,7 @@
           <w:sz w:val="16"/>
           <w:szCs w:val="16"/>
         </w:rPr>
-        <w:t>Tricco AC, Lillie E, Zarin W, O'Brien KK, Colquhoun H, Levac D, et al. PRISMA Extension for Scoping Reviews (</w:t>
-      </w:r>
-      <w:proofErr w:type="spellStart"/>
-      <w:r>
-        <w:rPr>
-          <w:sz w:val="16"/>
-          <w:szCs w:val="16"/>
-        </w:rPr>
-        <w:t>PRISMAScR</w:t>
-      </w:r>
-      <w:proofErr w:type="spellEnd"/>
-      <w:r>
-        <w:rPr>
-          <w:sz w:val="16"/>
-          <w:szCs w:val="16"/>
-        </w:rPr>
-        <w:t xml:space="preserve">): Checklist and Explanation. Ann Intern Med. </w:t>
-      </w:r>
-      <w:proofErr w:type="gramStart"/>
-      <w:r>
-        <w:rPr>
-          <w:sz w:val="16"/>
-          <w:szCs w:val="16"/>
-        </w:rPr>
-        <w:t>2018;169:467</w:t>
-      </w:r>
-      <w:proofErr w:type="gramEnd"/>
-      <w:r>
-        <w:rPr>
-          <w:sz w:val="16"/>
-          <w:szCs w:val="16"/>
-        </w:rPr>
-        <w:t>–473.</w:t>
+        <w:t>Tricco AC, Lillie E, Zarin W, O'Brien KK, Colquhoun H, Levac D, et al. PRISMA Extension for Scoping Reviews (PRISMAScR): Checklist and Explanation. Ann Intern Med. 2018;169:467–473.</w:t>
       </w:r>
       <w:r>
         <w:rPr>
@@ -3458,7 +3462,6 @@
         <w:t xml:space="preserve"> </w:t>
       </w:r>
       <w:hyperlink r:id="rId12" w:history="1">
-        <w:proofErr w:type="spellStart"/>
         <w:r>
           <w:rPr>
             <w:rStyle w:val="Hipervnculo"/>
@@ -3466,17 +3469,7 @@
             <w:sz w:val="16"/>
             <w:szCs w:val="16"/>
           </w:rPr>
-          <w:t>doi</w:t>
-        </w:r>
-        <w:proofErr w:type="spellEnd"/>
-        <w:r>
-          <w:rPr>
-            <w:rStyle w:val="Hipervnculo"/>
-            <w:iCs/>
-            <w:sz w:val="16"/>
-            <w:szCs w:val="16"/>
-          </w:rPr>
-          <w:t>: 10.7326/M18-0850</w:t>
+          <w:t>doi: 10.7326/M18-0850</w:t>
         </w:r>
       </w:hyperlink>
       <w:r>
@@ -3500,7 +3493,7 @@
 </file>
 
 <file path=word/endnotes.xml><?xml version="1.0" encoding="utf-8"?>
-<w:endnotes xmlns:wpc="http://schemas.microsoft.com/office/word/2010/wordprocessingCanvas" xmlns:cx="http://schemas.microsoft.com/office/drawing/2014/chartex" xmlns:cx1="http://schemas.microsoft.com/office/drawing/2015/9/8/chartex" xmlns:cx2="http://schemas.microsoft.com/office/drawing/2015/10/21/chartex" xmlns:cx3="http://schemas.microsoft.com/office/drawing/2016/5/9/chartex" xmlns:cx4="http://schemas.microsoft.com/office/drawing/2016/5/10/chartex" xmlns:cx5="http://schemas.microsoft.com/office/drawing/2016/5/11/chartex" xmlns:cx6="http://schemas.microsoft.com/office/drawing/2016/5/12/chartex" xmlns:cx7="http://schemas.microsoft.com/office/drawing/2016/5/13/chartex" xmlns:cx8="http://schemas.microsoft.com/office/drawing/2016/5/14/chartex" xmlns:mc="http://schemas.openxmlformats.org/markup-compatibility/2006" xmlns:aink="http://schemas.microsoft.com/office/drawing/2016/ink" xmlns:am3d="http://schemas.microsoft.com/office/drawing/2017/model3d" xmlns:o="urn:schemas-microsoft-com:office:office" xmlns:oel="http://schemas.microsoft.com/office/2019/extlst" xmlns:r="http://schemas.openxmlformats.org/officeDocument/2006/relationships" xmlns:m="http://schemas.openxmlformats.org/officeDocument/2006/math" xmlns:v="urn:schemas-microsoft-com:vml" xmlns:wp14="http://schemas.microsoft.com/office/word/2010/wordprocessingDrawing" xmlns:wp="http://schemas.openxmlformats.org/drawingml/2006/wordprocessingDrawing" xmlns:w10="urn:schemas-microsoft-com:office:word" xmlns:w="http://schemas.openxmlformats.org/wordprocessingml/2006/main" xmlns:w14="http://schemas.microsoft.com/office/word/2010/wordml" xmlns:w15="http://schemas.microsoft.com/office/word/2012/wordml" xmlns:w16cex="http://schemas.microsoft.com/office/word/2018/wordml/cex" xmlns:w16cid="http://schemas.microsoft.com/office/word/2016/wordml/cid" xmlns:w16="http://schemas.microsoft.com/office/word/2018/wordml" xmlns:w16du="http://schemas.microsoft.com/office/word/2023/wordml/word16du" xmlns:w16sdtdh="http://schemas.microsoft.com/office/word/2020/wordml/sdtdatahash" xmlns:w16se="http://schemas.microsoft.com/office/word/2015/wordml/symex" xmlns:wpg="http://schemas.microsoft.com/office/word/2010/wordprocessingGroup" xmlns:wpi="http://schemas.microsoft.com/office/word/2010/wordprocessingInk" xmlns:wne="http://schemas.microsoft.com/office/word/2006/wordml" xmlns:wps="http://schemas.microsoft.com/office/word/2010/wordprocessingShape" mc:Ignorable="w14 w15 w16se w16cid w16 w16cex w16sdtdh w16du wp14">
+<w:endnotes xmlns:wpc="http://schemas.microsoft.com/office/word/2010/wordprocessingCanvas" xmlns:cx="http://schemas.microsoft.com/office/drawing/2014/chartex" xmlns:cx1="http://schemas.microsoft.com/office/drawing/2015/9/8/chartex" xmlns:cx2="http://schemas.microsoft.com/office/drawing/2015/10/21/chartex" xmlns:cx3="http://schemas.microsoft.com/office/drawing/2016/5/9/chartex" xmlns:cx4="http://schemas.microsoft.com/office/drawing/2016/5/10/chartex" xmlns:cx5="http://schemas.microsoft.com/office/drawing/2016/5/11/chartex" xmlns:cx6="http://schemas.microsoft.com/office/drawing/2016/5/12/chartex" xmlns:cx7="http://schemas.microsoft.com/office/drawing/2016/5/13/chartex" xmlns:cx8="http://schemas.microsoft.com/office/drawing/2016/5/14/chartex" xmlns:mc="http://schemas.openxmlformats.org/markup-compatibility/2006" xmlns:aink="http://schemas.microsoft.com/office/drawing/2016/ink" xmlns:am3d="http://schemas.microsoft.com/office/drawing/2017/model3d" xmlns:o="urn:schemas-microsoft-com:office:office" xmlns:r="http://schemas.openxmlformats.org/officeDocument/2006/relationships" xmlns:m="http://schemas.openxmlformats.org/officeDocument/2006/math" xmlns:v="urn:schemas-microsoft-com:vml" xmlns:wp14="http://schemas.microsoft.com/office/word/2010/wordprocessingDrawing" xmlns:wp="http://schemas.openxmlformats.org/drawingml/2006/wordprocessingDrawing" xmlns:w10="urn:schemas-microsoft-com:office:word" xmlns:w="http://schemas.openxmlformats.org/wordprocessingml/2006/main" xmlns:w14="http://schemas.microsoft.com/office/word/2010/wordml" xmlns:w15="http://schemas.microsoft.com/office/word/2012/wordml" xmlns:w16cex="http://schemas.microsoft.com/office/word/2018/wordml/cex" xmlns:w16cid="http://schemas.microsoft.com/office/word/2016/wordml/cid" xmlns:w16="http://schemas.microsoft.com/office/word/2018/wordml" xmlns:w16sdtdh="http://schemas.microsoft.com/office/word/2020/wordml/sdtdatahash" xmlns:w16se="http://schemas.microsoft.com/office/word/2015/wordml/symex" xmlns:wpg="http://schemas.microsoft.com/office/word/2010/wordprocessingGroup" xmlns:wpi="http://schemas.microsoft.com/office/word/2010/wordprocessingInk" xmlns:wne="http://schemas.microsoft.com/office/word/2006/wordml" xmlns:wps="http://schemas.microsoft.com/office/word/2010/wordprocessingShape" mc:Ignorable="w14 w15 w16se w16cid w16 w16cex w16sdtdh wp14">
   <w:endnote w:type="separator" w:id="-1">
     <w:p>
       <w:pPr>
@@ -3525,7 +3518,7 @@
 </file>
 
 <file path=word/footer1.xml><?xml version="1.0" encoding="utf-8"?>
-<w:ftr xmlns:wpc="http://schemas.microsoft.com/office/word/2010/wordprocessingCanvas" xmlns:cx="http://schemas.microsoft.com/office/drawing/2014/chartex" xmlns:cx1="http://schemas.microsoft.com/office/drawing/2015/9/8/chartex" xmlns:cx2="http://schemas.microsoft.com/office/drawing/2015/10/21/chartex" xmlns:cx3="http://schemas.microsoft.com/office/drawing/2016/5/9/chartex" xmlns:cx4="http://schemas.microsoft.com/office/drawing/2016/5/10/chartex" xmlns:cx5="http://schemas.microsoft.com/office/drawing/2016/5/11/chartex" xmlns:cx6="http://schemas.microsoft.com/office/drawing/2016/5/12/chartex" xmlns:cx7="http://schemas.microsoft.com/office/drawing/2016/5/13/chartex" xmlns:cx8="http://schemas.microsoft.com/office/drawing/2016/5/14/chartex" xmlns:mc="http://schemas.openxmlformats.org/markup-compatibility/2006" xmlns:aink="http://schemas.microsoft.com/office/drawing/2016/ink" xmlns:am3d="http://schemas.microsoft.com/office/drawing/2017/model3d" xmlns:o="urn:schemas-microsoft-com:office:office" xmlns:oel="http://schemas.microsoft.com/office/2019/extlst" xmlns:r="http://schemas.openxmlformats.org/officeDocument/2006/relationships" xmlns:m="http://schemas.openxmlformats.org/officeDocument/2006/math" xmlns:v="urn:schemas-microsoft-com:vml" xmlns:wp14="http://schemas.microsoft.com/office/word/2010/wordprocessingDrawing" xmlns:wp="http://schemas.openxmlformats.org/drawingml/2006/wordprocessingDrawing" xmlns:w10="urn:schemas-microsoft-com:office:word" xmlns:w="http://schemas.openxmlformats.org/wordprocessingml/2006/main" xmlns:w14="http://schemas.microsoft.com/office/word/2010/wordml" xmlns:w15="http://schemas.microsoft.com/office/word/2012/wordml" xmlns:w16cex="http://schemas.microsoft.com/office/word/2018/wordml/cex" xmlns:w16cid="http://schemas.microsoft.com/office/word/2016/wordml/cid" xmlns:w16="http://schemas.microsoft.com/office/word/2018/wordml" xmlns:w16du="http://schemas.microsoft.com/office/word/2023/wordml/word16du" xmlns:w16sdtdh="http://schemas.microsoft.com/office/word/2020/wordml/sdtdatahash" xmlns:w16se="http://schemas.microsoft.com/office/word/2015/wordml/symex" xmlns:wpg="http://schemas.microsoft.com/office/word/2010/wordprocessingGroup" xmlns:wpi="http://schemas.microsoft.com/office/word/2010/wordprocessingInk" xmlns:wne="http://schemas.microsoft.com/office/word/2006/wordml" xmlns:wps="http://schemas.microsoft.com/office/word/2010/wordprocessingShape" mc:Ignorable="w14 w15 w16se w16cid w16 w16cex w16sdtdh w16du wp14">
+<w:ftr xmlns:wpc="http://schemas.microsoft.com/office/word/2010/wordprocessingCanvas" xmlns:cx="http://schemas.microsoft.com/office/drawing/2014/chartex" xmlns:cx1="http://schemas.microsoft.com/office/drawing/2015/9/8/chartex" xmlns:cx2="http://schemas.microsoft.com/office/drawing/2015/10/21/chartex" xmlns:cx3="http://schemas.microsoft.com/office/drawing/2016/5/9/chartex" xmlns:cx4="http://schemas.microsoft.com/office/drawing/2016/5/10/chartex" xmlns:cx5="http://schemas.microsoft.com/office/drawing/2016/5/11/chartex" xmlns:cx6="http://schemas.microsoft.com/office/drawing/2016/5/12/chartex" xmlns:cx7="http://schemas.microsoft.com/office/drawing/2016/5/13/chartex" xmlns:cx8="http://schemas.microsoft.com/office/drawing/2016/5/14/chartex" xmlns:mc="http://schemas.openxmlformats.org/markup-compatibility/2006" xmlns:aink="http://schemas.microsoft.com/office/drawing/2016/ink" xmlns:am3d="http://schemas.microsoft.com/office/drawing/2017/model3d" xmlns:o="urn:schemas-microsoft-com:office:office" xmlns:r="http://schemas.openxmlformats.org/officeDocument/2006/relationships" xmlns:m="http://schemas.openxmlformats.org/officeDocument/2006/math" xmlns:v="urn:schemas-microsoft-com:vml" xmlns:wp14="http://schemas.microsoft.com/office/word/2010/wordprocessingDrawing" xmlns:wp="http://schemas.openxmlformats.org/drawingml/2006/wordprocessingDrawing" xmlns:w10="urn:schemas-microsoft-com:office:word" xmlns:w="http://schemas.openxmlformats.org/wordprocessingml/2006/main" xmlns:w14="http://schemas.microsoft.com/office/word/2010/wordml" xmlns:w15="http://schemas.microsoft.com/office/word/2012/wordml" xmlns:w16cex="http://schemas.microsoft.com/office/word/2018/wordml/cex" xmlns:w16cid="http://schemas.microsoft.com/office/word/2016/wordml/cid" xmlns:w16="http://schemas.microsoft.com/office/word/2018/wordml" xmlns:w16sdtdh="http://schemas.microsoft.com/office/word/2020/wordml/sdtdatahash" xmlns:w16se="http://schemas.microsoft.com/office/word/2015/wordml/symex" xmlns:wpg="http://schemas.microsoft.com/office/word/2010/wordprocessingGroup" xmlns:wpi="http://schemas.microsoft.com/office/word/2010/wordprocessingInk" xmlns:wne="http://schemas.microsoft.com/office/word/2006/wordml" xmlns:wps="http://schemas.microsoft.com/office/word/2010/wordprocessingShape" mc:Ignorable="w14 w15 w16se w16cid w16 w16cex w16sdtdh wp14">
   <w:p>
     <w:pPr>
       <w:pStyle w:val="Piedepgina"/>
@@ -3684,7 +3677,7 @@
                   <v:stroke joinstyle="miter"/>
                   <v:path gradientshapeok="t" o:connecttype="rect"/>
                 </v:shapetype>
-                <v:shape id="Text Box 95" o:spid="_x0000_s1026" type="#_x0000_t202" style="position:absolute;margin-left:18pt;margin-top:-1.7pt;width:106.5pt;height:46.5pt;z-index:251676672;visibility:visible;mso-wrap-style:square;mso-width-percent:0;mso-height-percent:0;mso-wrap-distance-left:9pt;mso-wrap-distance-top:0;mso-wrap-distance-right:9pt;mso-wrap-distance-bottom:0;mso-position-horizontal:absolute;mso-position-horizontal-relative:text;mso-position-vertical:absolute;mso-position-vertical-relative:text;mso-width-percent:0;mso-height-percent:0;mso-width-relative:margin;mso-height-relative:margin;v-text-anchor:top" o:gfxdata="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" fillcolor="white [3201]" stroked="f" strokeweight=".5pt">
+                <v:shape id="Text Box 95" o:spid="_x0000_s1026" type="#_x0000_t202" style="position:absolute;margin-left:18pt;margin-top:-1.7pt;width:106.5pt;height:46.5pt;z-index:251676672;visibility:visible;mso-wrap-style:square;mso-width-percent:0;mso-height-percent:0;mso-wrap-distance-left:9pt;mso-wrap-distance-top:0;mso-wrap-distance-right:9pt;mso-wrap-distance-bottom:0;mso-position-horizontal:absolute;mso-position-horizontal-relative:text;mso-position-vertical:absolute;mso-position-vertical-relative:text;mso-width-percent:0;mso-height-percent:0;mso-width-relative:margin;mso-height-relative:margin;v-text-anchor:top" o:gfxdata="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" fillcolor="white [3201]" stroked="f" strokeweight=".5pt">
                   <v:textbox>
                     <w:txbxContent>
                       <w:p>
@@ -4001,7 +3994,7 @@
         </mc:Choice>
         <mc:Fallback>
           <w:pict>
-            <v:shape w14:anchorId="14417FCE" id="Rectangle 12" o:spid="_x0000_s1026" style="position:absolute;margin-left:-120.85pt;margin-top:53.6pt;width:778.45pt;height:18pt;z-index:251678720;visibility:visible;mso-wrap-style:square;mso-wrap-distance-left:9pt;mso-wrap-distance-top:0;mso-wrap-distance-right:9pt;mso-wrap-distance-bottom:0;mso-position-horizontal:absolute;mso-position-horizontal-relative:text;mso-position-vertical:absolute;mso-position-vertical-relative:text;v-text-anchor:middle" coordsize="8686896,228844" o:gfxdata="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" path="m861333,244r7825563,l8686896,228844,96,228844c-10536,227072,861333,-8617,861333,244xe" fillcolor="#3e7dbc [3206]" stroked="f" strokeweight="2pt">
+            <v:shape w14:anchorId="3305790F" id="Rectangle 12" o:spid="_x0000_s1026" style="position:absolute;margin-left:-120.85pt;margin-top:53.6pt;width:778.45pt;height:18pt;z-index:251678720;visibility:visible;mso-wrap-style:square;mso-wrap-distance-left:9pt;mso-wrap-distance-top:0;mso-wrap-distance-right:9pt;mso-wrap-distance-bottom:0;mso-position-horizontal:absolute;mso-position-horizontal-relative:text;mso-position-vertical:absolute;mso-position-vertical-relative:text;v-text-anchor:middle" coordsize="8686896,228844" o:gfxdata="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" path="m861333,244r7825563,l8686896,228844,96,228844c-10536,227072,861333,-8617,861333,244xe" fillcolor="#3e7dbc [3206]" stroked="f" strokeweight="2pt">
               <v:fill color2="#2e5d8c [2406]" rotate="t" focus="100%" type="gradientRadial"/>
               <v:path arrowok="t" o:connecttype="custom" o:connectlocs="980259,244;9886315,244;9886315,228600;109,228600;980259,244" o:connectangles="0,0,0,0,0"/>
             </v:shape>
@@ -4035,7 +4028,7 @@
 </file>
 
 <file path=word/footnotes.xml><?xml version="1.0" encoding="utf-8"?>
-<w:footnotes xmlns:wpc="http://schemas.microsoft.com/office/word/2010/wordprocessingCanvas" xmlns:cx="http://schemas.microsoft.com/office/drawing/2014/chartex" xmlns:cx1="http://schemas.microsoft.com/office/drawing/2015/9/8/chartex" xmlns:cx2="http://schemas.microsoft.com/office/drawing/2015/10/21/chartex" xmlns:cx3="http://schemas.microsoft.com/office/drawing/2016/5/9/chartex" xmlns:cx4="http://schemas.microsoft.com/office/drawing/2016/5/10/chartex" xmlns:cx5="http://schemas.microsoft.com/office/drawing/2016/5/11/chartex" xmlns:cx6="http://schemas.microsoft.com/office/drawing/2016/5/12/chartex" xmlns:cx7="http://schemas.microsoft.com/office/drawing/2016/5/13/chartex" xmlns:cx8="http://schemas.microsoft.com/office/drawing/2016/5/14/chartex" xmlns:mc="http://schemas.openxmlformats.org/markup-compatibility/2006" xmlns:aink="http://schemas.microsoft.com/office/drawing/2016/ink" xmlns:am3d="http://schemas.microsoft.com/office/drawing/2017/model3d" xmlns:o="urn:schemas-microsoft-com:office:office" xmlns:oel="http://schemas.microsoft.com/office/2019/extlst" xmlns:r="http://schemas.openxmlformats.org/officeDocument/2006/relationships" xmlns:m="http://schemas.openxmlformats.org/officeDocument/2006/math" xmlns:v="urn:schemas-microsoft-com:vml" xmlns:wp14="http://schemas.microsoft.com/office/word/2010/wordprocessingDrawing" xmlns:wp="http://schemas.openxmlformats.org/drawingml/2006/wordprocessingDrawing" xmlns:w10="urn:schemas-microsoft-com:office:word" xmlns:w="http://schemas.openxmlformats.org/wordprocessingml/2006/main" xmlns:w14="http://schemas.microsoft.com/office/word/2010/wordml" xmlns:w15="http://schemas.microsoft.com/office/word/2012/wordml" xmlns:w16cex="http://schemas.microsoft.com/office/word/2018/wordml/cex" xmlns:w16cid="http://schemas.microsoft.com/office/word/2016/wordml/cid" xmlns:w16="http://schemas.microsoft.com/office/word/2018/wordml" xmlns:w16du="http://schemas.microsoft.com/office/word/2023/wordml/word16du" xmlns:w16sdtdh="http://schemas.microsoft.com/office/word/2020/wordml/sdtdatahash" xmlns:w16se="http://schemas.microsoft.com/office/word/2015/wordml/symex" xmlns:wpg="http://schemas.microsoft.com/office/word/2010/wordprocessingGroup" xmlns:wpi="http://schemas.microsoft.com/office/word/2010/wordprocessingInk" xmlns:wne="http://schemas.microsoft.com/office/word/2006/wordml" xmlns:wps="http://schemas.microsoft.com/office/word/2010/wordprocessingShape" mc:Ignorable="w14 w15 w16se w16cid w16 w16cex w16sdtdh w16du wp14">
+<w:footnotes xmlns:wpc="http://schemas.microsoft.com/office/word/2010/wordprocessingCanvas" xmlns:cx="http://schemas.microsoft.com/office/drawing/2014/chartex" xmlns:cx1="http://schemas.microsoft.com/office/drawing/2015/9/8/chartex" xmlns:cx2="http://schemas.microsoft.com/office/drawing/2015/10/21/chartex" xmlns:cx3="http://schemas.microsoft.com/office/drawing/2016/5/9/chartex" xmlns:cx4="http://schemas.microsoft.com/office/drawing/2016/5/10/chartex" xmlns:cx5="http://schemas.microsoft.com/office/drawing/2016/5/11/chartex" xmlns:cx6="http://schemas.microsoft.com/office/drawing/2016/5/12/chartex" xmlns:cx7="http://schemas.microsoft.com/office/drawing/2016/5/13/chartex" xmlns:cx8="http://schemas.microsoft.com/office/drawing/2016/5/14/chartex" xmlns:mc="http://schemas.openxmlformats.org/markup-compatibility/2006" xmlns:aink="http://schemas.microsoft.com/office/drawing/2016/ink" xmlns:am3d="http://schemas.microsoft.com/office/drawing/2017/model3d" xmlns:o="urn:schemas-microsoft-com:office:office" xmlns:r="http://schemas.openxmlformats.org/officeDocument/2006/relationships" xmlns:m="http://schemas.openxmlformats.org/officeDocument/2006/math" xmlns:v="urn:schemas-microsoft-com:vml" xmlns:wp14="http://schemas.microsoft.com/office/word/2010/wordprocessingDrawing" xmlns:wp="http://schemas.openxmlformats.org/drawingml/2006/wordprocessingDrawing" xmlns:w10="urn:schemas-microsoft-com:office:word" xmlns:w="http://schemas.openxmlformats.org/wordprocessingml/2006/main" xmlns:w14="http://schemas.microsoft.com/office/word/2010/wordml" xmlns:w15="http://schemas.microsoft.com/office/word/2012/wordml" xmlns:w16cex="http://schemas.microsoft.com/office/word/2018/wordml/cex" xmlns:w16cid="http://schemas.microsoft.com/office/word/2016/wordml/cid" xmlns:w16="http://schemas.microsoft.com/office/word/2018/wordml" xmlns:w16sdtdh="http://schemas.microsoft.com/office/word/2020/wordml/sdtdatahash" xmlns:w16se="http://schemas.microsoft.com/office/word/2015/wordml/symex" xmlns:wpg="http://schemas.microsoft.com/office/word/2010/wordprocessingGroup" xmlns:wpi="http://schemas.microsoft.com/office/word/2010/wordprocessingInk" xmlns:wne="http://schemas.microsoft.com/office/word/2006/wordml" xmlns:wps="http://schemas.microsoft.com/office/word/2010/wordprocessingShape" mc:Ignorable="w14 w15 w16se w16cid w16 w16cex w16sdtdh wp14">
   <w:footnote w:type="separator" w:id="-1">
     <w:p>
       <w:pPr>
@@ -4060,7 +4053,7 @@
 </file>
 
 <file path=word/header1.xml><?xml version="1.0" encoding="utf-8"?>
-<w:hdr xmlns:wpc="http://schemas.microsoft.com/office/word/2010/wordprocessingCanvas" xmlns:cx="http://schemas.microsoft.com/office/drawing/2014/chartex" xmlns:cx1="http://schemas.microsoft.com/office/drawing/2015/9/8/chartex" xmlns:cx2="http://schemas.microsoft.com/office/drawing/2015/10/21/chartex" xmlns:cx3="http://schemas.microsoft.com/office/drawing/2016/5/9/chartex" xmlns:cx4="http://schemas.microsoft.com/office/drawing/2016/5/10/chartex" xmlns:cx5="http://schemas.microsoft.com/office/drawing/2016/5/11/chartex" xmlns:cx6="http://schemas.microsoft.com/office/drawing/2016/5/12/chartex" xmlns:cx7="http://schemas.microsoft.com/office/drawing/2016/5/13/chartex" xmlns:cx8="http://schemas.microsoft.com/office/drawing/2016/5/14/chartex" xmlns:mc="http://schemas.openxmlformats.org/markup-compatibility/2006" xmlns:aink="http://schemas.microsoft.com/office/drawing/2016/ink" xmlns:am3d="http://schemas.microsoft.com/office/drawing/2017/model3d" xmlns:o="urn:schemas-microsoft-com:office:office" xmlns:oel="http://schemas.microsoft.com/office/2019/extlst" xmlns:r="http://schemas.openxmlformats.org/officeDocument/2006/relationships" xmlns:m="http://schemas.openxmlformats.org/officeDocument/2006/math" xmlns:v="urn:schemas-microsoft-com:vml" xmlns:wp14="http://schemas.microsoft.com/office/word/2010/wordprocessingDrawing" xmlns:wp="http://schemas.openxmlformats.org/drawingml/2006/wordprocessingDrawing" xmlns:w10="urn:schemas-microsoft-com:office:word" xmlns:w="http://schemas.openxmlformats.org/wordprocessingml/2006/main" xmlns:w14="http://schemas.microsoft.com/office/word/2010/wordml" xmlns:w15="http://schemas.microsoft.com/office/word/2012/wordml" xmlns:w16cex="http://schemas.microsoft.com/office/word/2018/wordml/cex" xmlns:w16cid="http://schemas.microsoft.com/office/word/2016/wordml/cid" xmlns:w16="http://schemas.microsoft.com/office/word/2018/wordml" xmlns:w16du="http://schemas.microsoft.com/office/word/2023/wordml/word16du" xmlns:w16sdtdh="http://schemas.microsoft.com/office/word/2020/wordml/sdtdatahash" xmlns:w16se="http://schemas.microsoft.com/office/word/2015/wordml/symex" xmlns:wpg="http://schemas.microsoft.com/office/word/2010/wordprocessingGroup" xmlns:wpi="http://schemas.microsoft.com/office/word/2010/wordprocessingInk" xmlns:wne="http://schemas.microsoft.com/office/word/2006/wordml" xmlns:wps="http://schemas.microsoft.com/office/word/2010/wordprocessingShape" mc:Ignorable="w14 w15 w16se w16cid w16 w16cex w16sdtdh w16du wp14">
+<w:hdr xmlns:wpc="http://schemas.microsoft.com/office/word/2010/wordprocessingCanvas" xmlns:cx="http://schemas.microsoft.com/office/drawing/2014/chartex" xmlns:cx1="http://schemas.microsoft.com/office/drawing/2015/9/8/chartex" xmlns:cx2="http://schemas.microsoft.com/office/drawing/2015/10/21/chartex" xmlns:cx3="http://schemas.microsoft.com/office/drawing/2016/5/9/chartex" xmlns:cx4="http://schemas.microsoft.com/office/drawing/2016/5/10/chartex" xmlns:cx5="http://schemas.microsoft.com/office/drawing/2016/5/11/chartex" xmlns:cx6="http://schemas.microsoft.com/office/drawing/2016/5/12/chartex" xmlns:cx7="http://schemas.microsoft.com/office/drawing/2016/5/13/chartex" xmlns:cx8="http://schemas.microsoft.com/office/drawing/2016/5/14/chartex" xmlns:mc="http://schemas.openxmlformats.org/markup-compatibility/2006" xmlns:aink="http://schemas.microsoft.com/office/drawing/2016/ink" xmlns:am3d="http://schemas.microsoft.com/office/drawing/2017/model3d" xmlns:o="urn:schemas-microsoft-com:office:office" xmlns:r="http://schemas.openxmlformats.org/officeDocument/2006/relationships" xmlns:m="http://schemas.openxmlformats.org/officeDocument/2006/math" xmlns:v="urn:schemas-microsoft-com:vml" xmlns:wp14="http://schemas.microsoft.com/office/word/2010/wordprocessingDrawing" xmlns:wp="http://schemas.openxmlformats.org/drawingml/2006/wordprocessingDrawing" xmlns:w10="urn:schemas-microsoft-com:office:word" xmlns:w="http://schemas.openxmlformats.org/wordprocessingml/2006/main" xmlns:w14="http://schemas.microsoft.com/office/word/2010/wordml" xmlns:w15="http://schemas.microsoft.com/office/word/2012/wordml" xmlns:w16cex="http://schemas.microsoft.com/office/word/2018/wordml/cex" xmlns:w16cid="http://schemas.microsoft.com/office/word/2016/wordml/cid" xmlns:w16="http://schemas.microsoft.com/office/word/2018/wordml" xmlns:w16sdtdh="http://schemas.microsoft.com/office/word/2020/wordml/sdtdatahash" xmlns:w16se="http://schemas.microsoft.com/office/word/2015/wordml/symex" xmlns:wpg="http://schemas.microsoft.com/office/word/2010/wordprocessingGroup" xmlns:wpi="http://schemas.microsoft.com/office/word/2010/wordprocessingInk" xmlns:wne="http://schemas.microsoft.com/office/word/2006/wordml" xmlns:wps="http://schemas.microsoft.com/office/word/2010/wordprocessingShape" mc:Ignorable="w14 w15 w16se w16cid w16 w16cex w16sdtdh wp14">
   <w:p>
     <w:pPr>
       <w:pStyle w:val="Encabezado"/>
@@ -4146,7 +4139,7 @@
         </mc:Choice>
         <mc:Fallback>
           <w:pict>
-            <v:rect w14:anchorId="2C90B0AC" id="Rectangle 11" o:spid="_x0000_s1026" style="position:absolute;margin-left:-72.5pt;margin-top:-36.3pt;width:821.35pt;height:18pt;z-index:251680768;visibility:visible;mso-wrap-style:square;mso-wrap-distance-left:9pt;mso-wrap-distance-top:0;mso-wrap-distance-right:9pt;mso-wrap-distance-bottom:0;mso-position-horizontal:absolute;mso-position-horizontal-relative:text;mso-position-vertical:absolute;mso-position-vertical-relative:text;v-text-anchor:middle" o:gfxdata="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" fillcolor="#2e5d8b [3204]" stroked="f" strokeweight="2pt">
+            <v:rect w14:anchorId="5349FF66" id="Rectangle 11" o:spid="_x0000_s1026" style="position:absolute;margin-left:-72.5pt;margin-top:-36.3pt;width:821.35pt;height:18pt;z-index:251680768;visibility:visible;mso-wrap-style:square;mso-wrap-distance-left:9pt;mso-wrap-distance-top:0;mso-wrap-distance-right:9pt;mso-wrap-distance-bottom:0;mso-position-horizontal:absolute;mso-position-horizontal-relative:text;mso-position-vertical:absolute;mso-position-vertical-relative:text;v-text-anchor:middle" o:gfxdata="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" fillcolor="#2e5d8b [3204]" stroked="f" strokeweight="2pt">
               <v:fill color2="#172e45 [1604]" focusposition="1,1" focussize="" focus="100%" type="gradientRadial"/>
             </v:rect>
           </w:pict>
@@ -4318,7 +4311,7 @@
         </mc:Choice>
         <mc:Fallback>
           <w:pict>
-            <v:shape w14:anchorId="220C84CB" id="Rectangle 12" o:spid="_x0000_s1026" style="position:absolute;margin-left:-31.6pt;margin-top:-36.3pt;width:778.45pt;height:18pt;z-index:251681792;visibility:visible;mso-wrap-style:square;mso-wrap-distance-left:9pt;mso-wrap-distance-top:0;mso-wrap-distance-right:9pt;mso-wrap-distance-bottom:0;mso-position-horizontal:absolute;mso-position-horizontal-relative:text;mso-position-vertical:absolute;mso-position-vertical-relative:text;v-text-anchor:middle" coordsize="8686896,228844" o:gfxdata="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" path="m861333,244r7825563,l8686896,228844,96,228844c-10536,227072,861333,-8617,861333,244xe" fillcolor="#3e7dbc [3206]" stroked="f" strokeweight="2pt">
+            <v:shape w14:anchorId="4CFA0D04" id="Rectangle 12" o:spid="_x0000_s1026" style="position:absolute;margin-left:-31.6pt;margin-top:-36.3pt;width:778.45pt;height:18pt;z-index:251681792;visibility:visible;mso-wrap-style:square;mso-wrap-distance-left:9pt;mso-wrap-distance-top:0;mso-wrap-distance-right:9pt;mso-wrap-distance-bottom:0;mso-position-horizontal:absolute;mso-position-horizontal-relative:text;mso-position-vertical:absolute;mso-position-vertical-relative:text;v-text-anchor:middle" coordsize="8686896,228844" o:gfxdata="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" path="m861333,244r7825563,l8686896,228844,96,228844c-10536,227072,861333,-8617,861333,244xe" fillcolor="#3e7dbc [3206]" stroked="f" strokeweight="2pt">
               <v:fill color2="#2e5d8c [2406]" rotate="t" focus="100%" type="gradientRadial"/>
               <v:path arrowok="t" o:connecttype="custom" o:connectlocs="980259,244;9886315,244;9886315,228600;109,228600;980259,244" o:connectangles="0,0,0,0,0"/>
             </v:shape>
@@ -4331,7 +4324,7 @@
 </file>
 
 <file path=word/numbering.xml><?xml version="1.0" encoding="utf-8"?>
-<w:numbering xmlns:wpc="http://schemas.microsoft.com/office/word/2010/wordprocessingCanvas" xmlns:cx="http://schemas.microsoft.com/office/drawing/2014/chartex" xmlns:cx1="http://schemas.microsoft.com/office/drawing/2015/9/8/chartex" xmlns:cx2="http://schemas.microsoft.com/office/drawing/2015/10/21/chartex" xmlns:cx3="http://schemas.microsoft.com/office/drawing/2016/5/9/chartex" xmlns:cx4="http://schemas.microsoft.com/office/drawing/2016/5/10/chartex" xmlns:cx5="http://schemas.microsoft.com/office/drawing/2016/5/11/chartex" xmlns:cx6="http://schemas.microsoft.com/office/drawing/2016/5/12/chartex" xmlns:cx7="http://schemas.microsoft.com/office/drawing/2016/5/13/chartex" xmlns:cx8="http://schemas.microsoft.com/office/drawing/2016/5/14/chartex" xmlns:mc="http://schemas.openxmlformats.org/markup-compatibility/2006" xmlns:aink="http://schemas.microsoft.com/office/drawing/2016/ink" xmlns:am3d="http://schemas.microsoft.com/office/drawing/2017/model3d" xmlns:o="urn:schemas-microsoft-com:office:office" xmlns:oel="http://schemas.microsoft.com/office/2019/extlst" xmlns:r="http://schemas.openxmlformats.org/officeDocument/2006/relationships" xmlns:m="http://schemas.openxmlformats.org/officeDocument/2006/math" xmlns:v="urn:schemas-microsoft-com:vml" xmlns:wp14="http://schemas.microsoft.com/office/word/2010/wordprocessingDrawing" xmlns:wp="http://schemas.openxmlformats.org/drawingml/2006/wordprocessingDrawing" xmlns:w10="urn:schemas-microsoft-com:office:word" xmlns:w="http://schemas.openxmlformats.org/wordprocessingml/2006/main" xmlns:w14="http://schemas.microsoft.com/office/word/2010/wordml" xmlns:w15="http://schemas.microsoft.com/office/word/2012/wordml" xmlns:w16cex="http://schemas.microsoft.com/office/word/2018/wordml/cex" xmlns:w16cid="http://schemas.microsoft.com/office/word/2016/wordml/cid" xmlns:w16="http://schemas.microsoft.com/office/word/2018/wordml" xmlns:w16du="http://schemas.microsoft.com/office/word/2023/wordml/word16du" xmlns:w16sdtdh="http://schemas.microsoft.com/office/word/2020/wordml/sdtdatahash" xmlns:w16se="http://schemas.microsoft.com/office/word/2015/wordml/symex" xmlns:wpg="http://schemas.microsoft.com/office/word/2010/wordprocessingGroup" xmlns:wpi="http://schemas.microsoft.com/office/word/2010/wordprocessingInk" xmlns:wne="http://schemas.microsoft.com/office/word/2006/wordml" xmlns:wps="http://schemas.microsoft.com/office/word/2010/wordprocessingShape" mc:Ignorable="w14 w15 w16se w16cid w16 w16cex w16sdtdh w16du wp14">
+<w:numbering xmlns:wpc="http://schemas.microsoft.com/office/word/2010/wordprocessingCanvas" xmlns:cx="http://schemas.microsoft.com/office/drawing/2014/chartex" xmlns:cx1="http://schemas.microsoft.com/office/drawing/2015/9/8/chartex" xmlns:cx2="http://schemas.microsoft.com/office/drawing/2015/10/21/chartex" xmlns:cx3="http://schemas.microsoft.com/office/drawing/2016/5/9/chartex" xmlns:cx4="http://schemas.microsoft.com/office/drawing/2016/5/10/chartex" xmlns:cx5="http://schemas.microsoft.com/office/drawing/2016/5/11/chartex" xmlns:cx6="http://schemas.microsoft.com/office/drawing/2016/5/12/chartex" xmlns:cx7="http://schemas.microsoft.com/office/drawing/2016/5/13/chartex" xmlns:cx8="http://schemas.microsoft.com/office/drawing/2016/5/14/chartex" xmlns:mc="http://schemas.openxmlformats.org/markup-compatibility/2006" xmlns:aink="http://schemas.microsoft.com/office/drawing/2016/ink" xmlns:am3d="http://schemas.microsoft.com/office/drawing/2017/model3d" xmlns:o="urn:schemas-microsoft-com:office:office" xmlns:r="http://schemas.openxmlformats.org/officeDocument/2006/relationships" xmlns:m="http://schemas.openxmlformats.org/officeDocument/2006/math" xmlns:v="urn:schemas-microsoft-com:vml" xmlns:wp14="http://schemas.microsoft.com/office/word/2010/wordprocessingDrawing" xmlns:wp="http://schemas.openxmlformats.org/drawingml/2006/wordprocessingDrawing" xmlns:w10="urn:schemas-microsoft-com:office:word" xmlns:w="http://schemas.openxmlformats.org/wordprocessingml/2006/main" xmlns:w14="http://schemas.microsoft.com/office/word/2010/wordml" xmlns:w15="http://schemas.microsoft.com/office/word/2012/wordml" xmlns:w16cex="http://schemas.microsoft.com/office/word/2018/wordml/cex" xmlns:w16cid="http://schemas.microsoft.com/office/word/2016/wordml/cid" xmlns:w16="http://schemas.microsoft.com/office/word/2018/wordml" xmlns:w16sdtdh="http://schemas.microsoft.com/office/word/2020/wordml/sdtdatahash" xmlns:w16se="http://schemas.microsoft.com/office/word/2015/wordml/symex" xmlns:wpg="http://schemas.microsoft.com/office/word/2010/wordprocessingGroup" xmlns:wpi="http://schemas.microsoft.com/office/word/2010/wordprocessingInk" xmlns:wne="http://schemas.microsoft.com/office/word/2006/wordml" xmlns:wps="http://schemas.microsoft.com/office/word/2010/wordprocessingShape" mc:Ignorable="w14 w15 w16se w16cid w16 w16cex w16sdtdh wp14">
   <w:abstractNum w:abstractNumId="0" w15:restartNumberingAfterBreak="0">
     <w:nsid w:val="025F1504"/>
     <w:multiLevelType w:val="hybridMultilevel"/>
@@ -5252,16 +5245,16 @@
       </w:rPr>
     </w:lvl>
   </w:abstractNum>
-  <w:num w:numId="1" w16cid:durableId="1173952432">
+  <w:num w:numId="1">
     <w:abstractNumId w:val="4"/>
   </w:num>
-  <w:num w:numId="2" w16cid:durableId="2040078890">
+  <w:num w:numId="2">
     <w:abstractNumId w:val="5"/>
   </w:num>
-  <w:num w:numId="3" w16cid:durableId="606620096">
+  <w:num w:numId="3">
     <w:abstractNumId w:val="7"/>
   </w:num>
-  <w:num w:numId="4" w16cid:durableId="2100708711">
+  <w:num w:numId="4">
     <w:abstractNumId w:val="1"/>
     <w:lvlOverride w:ilvl="0">
       <w:startOverride w:val="1"/>
@@ -5291,29 +5284,29 @@
       <w:startOverride w:val="1"/>
     </w:lvlOverride>
   </w:num>
-  <w:num w:numId="5" w16cid:durableId="2118596218">
+  <w:num w:numId="5">
     <w:abstractNumId w:val="9"/>
   </w:num>
-  <w:num w:numId="6" w16cid:durableId="1201555448">
+  <w:num w:numId="6">
     <w:abstractNumId w:val="8"/>
   </w:num>
-  <w:num w:numId="7" w16cid:durableId="578296317">
+  <w:num w:numId="7">
     <w:abstractNumId w:val="0"/>
   </w:num>
-  <w:num w:numId="8" w16cid:durableId="1695881299">
+  <w:num w:numId="8">
     <w:abstractNumId w:val="6"/>
   </w:num>
-  <w:num w:numId="9" w16cid:durableId="646933655">
+  <w:num w:numId="9">
     <w:abstractNumId w:val="2"/>
   </w:num>
-  <w:num w:numId="10" w16cid:durableId="595863198">
+  <w:num w:numId="10">
     <w:abstractNumId w:val="3"/>
   </w:num>
 </w:numbering>
 </file>
 
 <file path=word/styles.xml><?xml version="1.0" encoding="utf-8"?>
-<w:styles xmlns:mc="http://schemas.openxmlformats.org/markup-compatibility/2006" xmlns:r="http://schemas.openxmlformats.org/officeDocument/2006/relationships" xmlns:w="http://schemas.openxmlformats.org/wordprocessingml/2006/main" xmlns:w14="http://schemas.microsoft.com/office/word/2010/wordml" xmlns:w15="http://schemas.microsoft.com/office/word/2012/wordml" xmlns:w16cex="http://schemas.microsoft.com/office/word/2018/wordml/cex" xmlns:w16cid="http://schemas.microsoft.com/office/word/2016/wordml/cid" xmlns:w16="http://schemas.microsoft.com/office/word/2018/wordml" xmlns:w16du="http://schemas.microsoft.com/office/word/2023/wordml/word16du" xmlns:w16sdtdh="http://schemas.microsoft.com/office/word/2020/wordml/sdtdatahash" xmlns:w16se="http://schemas.microsoft.com/office/word/2015/wordml/symex" mc:Ignorable="w14 w15 w16se w16cid w16 w16cex w16sdtdh w16du">
+<w:styles xmlns:mc="http://schemas.openxmlformats.org/markup-compatibility/2006" xmlns:r="http://schemas.openxmlformats.org/officeDocument/2006/relationships" xmlns:w="http://schemas.openxmlformats.org/wordprocessingml/2006/main" xmlns:w14="http://schemas.microsoft.com/office/word/2010/wordml" xmlns:w15="http://schemas.microsoft.com/office/word/2012/wordml" xmlns:w16cex="http://schemas.microsoft.com/office/word/2018/wordml/cex" xmlns:w16cid="http://schemas.microsoft.com/office/word/2016/wordml/cid" xmlns:w16="http://schemas.microsoft.com/office/word/2018/wordml" xmlns:w16sdtdh="http://schemas.microsoft.com/office/word/2020/wordml/sdtdatahash" xmlns:w16se="http://schemas.microsoft.com/office/word/2015/wordml/symex" mc:Ignorable="w14 w15 w16se w16cid w16 w16cex w16sdtdh">
   <w:docDefaults>
     <w:rPrDefault>
       <w:rPr>
@@ -6827,7 +6820,7 @@
 </file>
 
 <file path=word/glossary/document.xml><?xml version="1.0" encoding="utf-8"?>
-<w:glossaryDocument xmlns:wpc="http://schemas.microsoft.com/office/word/2010/wordprocessingCanvas" xmlns:cx="http://schemas.microsoft.com/office/drawing/2014/chartex" xmlns:cx1="http://schemas.microsoft.com/office/drawing/2015/9/8/chartex" xmlns:cx2="http://schemas.microsoft.com/office/drawing/2015/10/21/chartex" xmlns:cx3="http://schemas.microsoft.com/office/drawing/2016/5/9/chartex" xmlns:cx4="http://schemas.microsoft.com/office/drawing/2016/5/10/chartex" xmlns:cx5="http://schemas.microsoft.com/office/drawing/2016/5/11/chartex" xmlns:cx6="http://schemas.microsoft.com/office/drawing/2016/5/12/chartex" xmlns:cx7="http://schemas.microsoft.com/office/drawing/2016/5/13/chartex" xmlns:cx8="http://schemas.microsoft.com/office/drawing/2016/5/14/chartex" xmlns:mc="http://schemas.openxmlformats.org/markup-compatibility/2006" xmlns:aink="http://schemas.microsoft.com/office/drawing/2016/ink" xmlns:am3d="http://schemas.microsoft.com/office/drawing/2017/model3d" xmlns:o="urn:schemas-microsoft-com:office:office" xmlns:oel="http://schemas.microsoft.com/office/2019/extlst" xmlns:r="http://schemas.openxmlformats.org/officeDocument/2006/relationships" xmlns:m="http://schemas.openxmlformats.org/officeDocument/2006/math" xmlns:v="urn:schemas-microsoft-com:vml" xmlns:wp14="http://schemas.microsoft.com/office/word/2010/wordprocessingDrawing" xmlns:wp="http://schemas.openxmlformats.org/drawingml/2006/wordprocessingDrawing" xmlns:w10="urn:schemas-microsoft-com:office:word" xmlns:w="http://schemas.openxmlformats.org/wordprocessingml/2006/main" xmlns:w14="http://schemas.microsoft.com/office/word/2010/wordml" xmlns:w15="http://schemas.microsoft.com/office/word/2012/wordml" xmlns:w16cex="http://schemas.microsoft.com/office/word/2018/wordml/cex" xmlns:w16cid="http://schemas.microsoft.com/office/word/2016/wordml/cid" xmlns:w16="http://schemas.microsoft.com/office/word/2018/wordml" xmlns:w16du="http://schemas.microsoft.com/office/word/2023/wordml/word16du" xmlns:w16sdtdh="http://schemas.microsoft.com/office/word/2020/wordml/sdtdatahash" xmlns:w16se="http://schemas.microsoft.com/office/word/2015/wordml/symex" xmlns:wpg="http://schemas.microsoft.com/office/word/2010/wordprocessingGroup" xmlns:wpi="http://schemas.microsoft.com/office/word/2010/wordprocessingInk" xmlns:wne="http://schemas.microsoft.com/office/word/2006/wordml" xmlns:wps="http://schemas.microsoft.com/office/word/2010/wordprocessingShape" mc:Ignorable="w14 w15 w16se w16cid w16 w16cex w16sdtdh w16du wp14">
+<w:glossaryDocument xmlns:wpc="http://schemas.microsoft.com/office/word/2010/wordprocessingCanvas" xmlns:cx="http://schemas.microsoft.com/office/drawing/2014/chartex" xmlns:cx1="http://schemas.microsoft.com/office/drawing/2015/9/8/chartex" xmlns:cx2="http://schemas.microsoft.com/office/drawing/2015/10/21/chartex" xmlns:cx3="http://schemas.microsoft.com/office/drawing/2016/5/9/chartex" xmlns:cx4="http://schemas.microsoft.com/office/drawing/2016/5/10/chartex" xmlns:cx5="http://schemas.microsoft.com/office/drawing/2016/5/11/chartex" xmlns:cx6="http://schemas.microsoft.com/office/drawing/2016/5/12/chartex" xmlns:cx7="http://schemas.microsoft.com/office/drawing/2016/5/13/chartex" xmlns:cx8="http://schemas.microsoft.com/office/drawing/2016/5/14/chartex" xmlns:mc="http://schemas.openxmlformats.org/markup-compatibility/2006" xmlns:aink="http://schemas.microsoft.com/office/drawing/2016/ink" xmlns:am3d="http://schemas.microsoft.com/office/drawing/2017/model3d" xmlns:o="urn:schemas-microsoft-com:office:office" xmlns:r="http://schemas.openxmlformats.org/officeDocument/2006/relationships" xmlns:m="http://schemas.openxmlformats.org/officeDocument/2006/math" xmlns:v="urn:schemas-microsoft-com:vml" xmlns:wp14="http://schemas.microsoft.com/office/word/2010/wordprocessingDrawing" xmlns:wp="http://schemas.openxmlformats.org/drawingml/2006/wordprocessingDrawing" xmlns:w10="urn:schemas-microsoft-com:office:word" xmlns:w="http://schemas.openxmlformats.org/wordprocessingml/2006/main" xmlns:w14="http://schemas.microsoft.com/office/word/2010/wordml" xmlns:w15="http://schemas.microsoft.com/office/word/2012/wordml" xmlns:w16cex="http://schemas.microsoft.com/office/word/2018/wordml/cex" xmlns:w16cid="http://schemas.microsoft.com/office/word/2016/wordml/cid" xmlns:w16="http://schemas.microsoft.com/office/word/2018/wordml" xmlns:w16sdtdh="http://schemas.microsoft.com/office/word/2020/wordml/sdtdatahash" xmlns:w16se="http://schemas.microsoft.com/office/word/2015/wordml/symex" xmlns:wpg="http://schemas.microsoft.com/office/word/2010/wordprocessingGroup" xmlns:wpi="http://schemas.microsoft.com/office/word/2010/wordprocessingInk" xmlns:wne="http://schemas.microsoft.com/office/word/2006/wordml" xmlns:wps="http://schemas.microsoft.com/office/word/2010/wordprocessingShape" mc:Ignorable="w14 w15 w16se w16cid w16 w16cex w16sdtdh wp14">
   <w:docParts>
     <w:docPart>
       <w:docPartPr>
@@ -6860,7 +6853,7 @@
 </file>
 
 <file path=word/glossary/fontTable.xml><?xml version="1.0" encoding="utf-8"?>
-<w:fonts xmlns:mc="http://schemas.openxmlformats.org/markup-compatibility/2006" xmlns:r="http://schemas.openxmlformats.org/officeDocument/2006/relationships" xmlns:w="http://schemas.openxmlformats.org/wordprocessingml/2006/main" xmlns:w14="http://schemas.microsoft.com/office/word/2010/wordml" xmlns:w15="http://schemas.microsoft.com/office/word/2012/wordml" xmlns:w16cex="http://schemas.microsoft.com/office/word/2018/wordml/cex" xmlns:w16cid="http://schemas.microsoft.com/office/word/2016/wordml/cid" xmlns:w16="http://schemas.microsoft.com/office/word/2018/wordml" xmlns:w16du="http://schemas.microsoft.com/office/word/2023/wordml/word16du" xmlns:w16sdtdh="http://schemas.microsoft.com/office/word/2020/wordml/sdtdatahash" xmlns:w16se="http://schemas.microsoft.com/office/word/2015/wordml/symex" mc:Ignorable="w14 w15 w16se w16cid w16 w16cex w16sdtdh w16du">
+<w:fonts xmlns:mc="http://schemas.openxmlformats.org/markup-compatibility/2006" xmlns:r="http://schemas.openxmlformats.org/officeDocument/2006/relationships" xmlns:w="http://schemas.openxmlformats.org/wordprocessingml/2006/main" xmlns:w14="http://schemas.microsoft.com/office/word/2010/wordml" xmlns:w15="http://schemas.microsoft.com/office/word/2012/wordml" xmlns:w16cex="http://schemas.microsoft.com/office/word/2018/wordml/cex" xmlns:w16cid="http://schemas.microsoft.com/office/word/2016/wordml/cid" xmlns:w16="http://schemas.microsoft.com/office/word/2018/wordml" xmlns:w16sdtdh="http://schemas.microsoft.com/office/word/2020/wordml/sdtdatahash" xmlns:w16se="http://schemas.microsoft.com/office/word/2015/wordml/symex" mc:Ignorable="w14 w15 w16se w16cid w16 w16cex w16sdtdh">
   <w:font w:name="Times New Roman">
     <w:panose1 w:val="02020603050405020304"/>
     <w:charset w:val="00"/>
@@ -6904,23 +6897,25 @@
     <w:pitch w:val="variable"/>
     <w:sig w:usb0="00000003" w:usb1="00000000" w:usb2="00000000" w:usb3="00000000" w:csb0="00000001" w:csb1="00000000"/>
   </w:font>
-  <w:font w:name="Aptos">
+  <w:font w:name="Calibri">
+    <w:panose1 w:val="020F0502020204030204"/>
     <w:charset w:val="00"/>
     <w:family w:val="swiss"/>
     <w:pitch w:val="variable"/>
-    <w:sig w:usb0="20000287" w:usb1="00000003" w:usb2="00000000" w:usb3="00000000" w:csb0="0000019F" w:csb1="00000000"/>
+    <w:sig w:usb0="E4002EFF" w:usb1="C200247B" w:usb2="00000009" w:usb3="00000000" w:csb0="000001FF" w:csb1="00000000"/>
   </w:font>
-  <w:font w:name="Aptos Display">
+  <w:font w:name="Calibri Light">
+    <w:panose1 w:val="020F0302020204030204"/>
     <w:charset w:val="00"/>
     <w:family w:val="swiss"/>
     <w:pitch w:val="variable"/>
-    <w:sig w:usb0="20000287" w:usb1="00000003" w:usb2="00000000" w:usb3="00000000" w:csb0="0000019F" w:csb1="00000000"/>
+    <w:sig w:usb0="E4002EFF" w:usb1="C200247B" w:usb2="00000009" w:usb3="00000000" w:csb0="000001FF" w:csb1="00000000"/>
   </w:font>
 </w:fonts>
 </file>
 
 <file path=word/glossary/settings.xml><?xml version="1.0" encoding="utf-8"?>
-<w:settings xmlns:mc="http://schemas.openxmlformats.org/markup-compatibility/2006" xmlns:o="urn:schemas-microsoft-com:office:office" xmlns:r="http://schemas.openxmlformats.org/officeDocument/2006/relationships" xmlns:m="http://schemas.openxmlformats.org/officeDocument/2006/math" xmlns:v="urn:schemas-microsoft-com:vml" xmlns:w10="urn:schemas-microsoft-com:office:word" xmlns:w="http://schemas.openxmlformats.org/wordprocessingml/2006/main" xmlns:w14="http://schemas.microsoft.com/office/word/2010/wordml" xmlns:w15="http://schemas.microsoft.com/office/word/2012/wordml" xmlns:w16cex="http://schemas.microsoft.com/office/word/2018/wordml/cex" xmlns:w16cid="http://schemas.microsoft.com/office/word/2016/wordml/cid" xmlns:w16="http://schemas.microsoft.com/office/word/2018/wordml" xmlns:w16du="http://schemas.microsoft.com/office/word/2023/wordml/word16du" xmlns:w16sdtdh="http://schemas.microsoft.com/office/word/2020/wordml/sdtdatahash" xmlns:w16se="http://schemas.microsoft.com/office/word/2015/wordml/symex" xmlns:sl="http://schemas.openxmlformats.org/schemaLibrary/2006/main" mc:Ignorable="w14 w15 w16se w16cid w16 w16cex w16sdtdh w16du">
+<w:settings xmlns:mc="http://schemas.openxmlformats.org/markup-compatibility/2006" xmlns:o="urn:schemas-microsoft-com:office:office" xmlns:r="http://schemas.openxmlformats.org/officeDocument/2006/relationships" xmlns:m="http://schemas.openxmlformats.org/officeDocument/2006/math" xmlns:v="urn:schemas-microsoft-com:vml" xmlns:w10="urn:schemas-microsoft-com:office:word" xmlns:w="http://schemas.openxmlformats.org/wordprocessingml/2006/main" xmlns:w14="http://schemas.microsoft.com/office/word/2010/wordml" xmlns:w15="http://schemas.microsoft.com/office/word/2012/wordml" xmlns:w16cex="http://schemas.microsoft.com/office/word/2018/wordml/cex" xmlns:w16cid="http://schemas.microsoft.com/office/word/2016/wordml/cid" xmlns:w16="http://schemas.microsoft.com/office/word/2018/wordml" xmlns:w16sdtdh="http://schemas.microsoft.com/office/word/2020/wordml/sdtdatahash" xmlns:w16se="http://schemas.microsoft.com/office/word/2015/wordml/symex" xmlns:sl="http://schemas.openxmlformats.org/schemaLibrary/2006/main" mc:Ignorable="w14 w15 w16se w16cid w16 w16cex w16sdtdh">
   <w:view w:val="normal"/>
   <w:revisionView w:formatting="0"/>
   <w:defaultTabStop w:val="720"/>
@@ -6956,13 +6951,13 @@
   </m:mathPr>
   <w:themeFontLang w:val="en-CA"/>
   <w:clrSchemeMapping w:bg1="light1" w:t1="dark1" w:bg2="light2" w:t2="dark2" w:accent1="accent1" w:accent2="accent2" w:accent3="accent3" w:accent4="accent4" w:accent5="accent5" w:accent6="accent6" w:hyperlink="hyperlink" w:followedHyperlink="followedHyperlink"/>
-  <w:decimalSymbol w:val="."/>
-  <w:listSeparator w:val=","/>
+  <w:decimalSymbol w:val=","/>
+  <w:listSeparator w:val=";"/>
 </w:settings>
 </file>
 
 <file path=word/glossary/styles.xml><?xml version="1.0" encoding="utf-8"?>
-<w:styles xmlns:mc="http://schemas.openxmlformats.org/markup-compatibility/2006" xmlns:r="http://schemas.openxmlformats.org/officeDocument/2006/relationships" xmlns:w="http://schemas.openxmlformats.org/wordprocessingml/2006/main" xmlns:w14="http://schemas.microsoft.com/office/word/2010/wordml" xmlns:w15="http://schemas.microsoft.com/office/word/2012/wordml" xmlns:w16cex="http://schemas.microsoft.com/office/word/2018/wordml/cex" xmlns:w16cid="http://schemas.microsoft.com/office/word/2016/wordml/cid" xmlns:w16="http://schemas.microsoft.com/office/word/2018/wordml" xmlns:w16du="http://schemas.microsoft.com/office/word/2023/wordml/word16du" xmlns:w16sdtdh="http://schemas.microsoft.com/office/word/2020/wordml/sdtdatahash" xmlns:w16se="http://schemas.microsoft.com/office/word/2015/wordml/symex" mc:Ignorable="w14 w15 w16se w16cid w16 w16cex w16sdtdh w16du">
+<w:styles xmlns:mc="http://schemas.openxmlformats.org/markup-compatibility/2006" xmlns:r="http://schemas.openxmlformats.org/officeDocument/2006/relationships" xmlns:w="http://schemas.openxmlformats.org/wordprocessingml/2006/main" xmlns:w14="http://schemas.microsoft.com/office/word/2010/wordml" xmlns:w15="http://schemas.microsoft.com/office/word/2012/wordml" xmlns:w16cex="http://schemas.microsoft.com/office/word/2018/wordml/cex" xmlns:w16cid="http://schemas.microsoft.com/office/word/2016/wordml/cid" xmlns:w16="http://schemas.microsoft.com/office/word/2018/wordml" xmlns:w16sdtdh="http://schemas.microsoft.com/office/word/2020/wordml/sdtdatahash" xmlns:w16se="http://schemas.microsoft.com/office/word/2015/wordml/symex" mc:Ignorable="w14 w15 w16se w16cid w16 w16cex w16sdtdh">
   <w:docDefaults>
     <w:rPrDefault>
       <w:rPr>
@@ -7397,25 +7392,11 @@
       <w:color w:val="808080"/>
     </w:rPr>
   </w:style>
-  <w:style w:type="paragraph" w:customStyle="1" w:styleId="4BEDDA9F9574406791FD88A08665E1F1">
-    <w:name w:val="4BEDDA9F9574406791FD88A08665E1F1"/>
-    <w:rsid w:val="00A47B40"/>
-    <w:pPr>
-      <w:spacing w:after="160" w:line="278" w:lineRule="auto"/>
-    </w:pPr>
-    <w:rPr>
-      <w:kern w:val="2"/>
-      <w:sz w:val="24"/>
-      <w:szCs w:val="24"/>
-      <w:lang w:val="es-CO" w:eastAsia="es-CO"/>
-      <w14:ligatures w14:val="standardContextual"/>
-    </w:rPr>
-  </w:style>
 </w:styles>
 </file>
 
 <file path=word/glossary/webSettings.xml><?xml version="1.0" encoding="utf-8"?>
-<w:webSettings xmlns:mc="http://schemas.openxmlformats.org/markup-compatibility/2006" xmlns:r="http://schemas.openxmlformats.org/officeDocument/2006/relationships" xmlns:w="http://schemas.openxmlformats.org/wordprocessingml/2006/main" xmlns:w14="http://schemas.microsoft.com/office/word/2010/wordml" xmlns:w15="http://schemas.microsoft.com/office/word/2012/wordml" xmlns:w16cex="http://schemas.microsoft.com/office/word/2018/wordml/cex" xmlns:w16cid="http://schemas.microsoft.com/office/word/2016/wordml/cid" xmlns:w16="http://schemas.microsoft.com/office/word/2018/wordml" xmlns:w16du="http://schemas.microsoft.com/office/word/2023/wordml/word16du" xmlns:w16sdtdh="http://schemas.microsoft.com/office/word/2020/wordml/sdtdatahash" xmlns:w16se="http://schemas.microsoft.com/office/word/2015/wordml/symex" mc:Ignorable="w14 w15 w16se w16cid w16 w16cex w16sdtdh w16du">
+<w:webSettings xmlns:mc="http://schemas.openxmlformats.org/markup-compatibility/2006" xmlns:r="http://schemas.openxmlformats.org/officeDocument/2006/relationships" xmlns:w="http://schemas.openxmlformats.org/wordprocessingml/2006/main" xmlns:w14="http://schemas.microsoft.com/office/word/2010/wordml" xmlns:w15="http://schemas.microsoft.com/office/word/2012/wordml" xmlns:w16cex="http://schemas.microsoft.com/office/word/2018/wordml/cex" xmlns:w16cid="http://schemas.microsoft.com/office/word/2016/wordml/cid" xmlns:w16="http://schemas.microsoft.com/office/word/2018/wordml" xmlns:w16sdtdh="http://schemas.microsoft.com/office/word/2020/wordml/sdtdatahash" xmlns:w16se="http://schemas.microsoft.com/office/word/2015/wordml/symex" mc:Ignorable="w14 w15 w16se w16cid w16 w16cex w16sdtdh">
   <w:optimizeForBrowser/>
   <w:allowPNG/>
 </w:webSettings>
@@ -7707,15 +7688,6 @@
 </file>
 
 <file path=customXml/item1.xml><?xml version="1.0" encoding="utf-8"?>
-<?mso-contentType ?>
-<FormTemplates xmlns="http://schemas.microsoft.com/sharepoint/v3/contenttype/forms">
-  <Display>DocumentLibraryForm</Display>
-  <Edit>DocumentLibraryForm</Edit>
-  <New>DocumentLibraryForm</New>
-</FormTemplates>
-</file>
-
-<file path=customXml/item2.xml><?xml version="1.0" encoding="utf-8"?>
 <p:properties xmlns:p="http://schemas.microsoft.com/office/2006/metadata/properties" xmlns:xsi="http://www.w3.org/2001/XMLSchema-instance" xmlns:pc="http://schemas.microsoft.com/office/infopath/2007/PartnerControls">
   <documentManagement>
     <_dlc_DocId xmlns="ddd86614-e075-45fd-ad75-7be4b83b486d">E7YEJEDTSY7N-616-142</_dlc_DocId>
@@ -7727,57 +7699,16 @@
 </p:properties>
 </file>
 
-<file path=customXml/item3.xml><?xml version="1.0" encoding="utf-8"?>
+<file path=customXml/item2.xml><?xml version="1.0" encoding="utf-8"?>
 <?mso-contentType ?>
-<spe:Receivers xmlns:spe="http://schemas.microsoft.com/sharepoint/events">
-  <Receiver>
-    <Name>Document ID Generator</Name>
-    <Synchronization>Synchronous</Synchronization>
-    <Type>10001</Type>
-    <SequenceNumber>1000</SequenceNumber>
-    <Assembly>Microsoft.Office.DocumentManagement, Version=14.0.0.0, Culture=neutral, PublicKeyToken=71e9bce111e9429c</Assembly>
-    <Class>Microsoft.Office.DocumentManagement.Internal.DocIdHandler</Class>
-    <Data/>
-    <Filter/>
-  </Receiver>
-  <Receiver>
-    <Name>Document ID Generator</Name>
-    <Synchronization>Synchronous</Synchronization>
-    <Type>10002</Type>
-    <SequenceNumber>1001</SequenceNumber>
-    <Assembly>Microsoft.Office.DocumentManagement, Version=14.0.0.0, Culture=neutral, PublicKeyToken=71e9bce111e9429c</Assembly>
-    <Class>Microsoft.Office.DocumentManagement.Internal.DocIdHandler</Class>
-    <Data/>
-    <Filter/>
-  </Receiver>
-  <Receiver>
-    <Name>Document ID Generator</Name>
-    <Synchronization>Synchronous</Synchronization>
-    <Type>10004</Type>
-    <SequenceNumber>1002</SequenceNumber>
-    <Assembly>Microsoft.Office.DocumentManagement, Version=14.0.0.0, Culture=neutral, PublicKeyToken=71e9bce111e9429c</Assembly>
-    <Class>Microsoft.Office.DocumentManagement.Internal.DocIdHandler</Class>
-    <Data/>
-    <Filter/>
-  </Receiver>
-  <Receiver>
-    <Name>Document ID Generator</Name>
-    <Synchronization>Synchronous</Synchronization>
-    <Type>10006</Type>
-    <SequenceNumber>1003</SequenceNumber>
-    <Assembly>Microsoft.Office.DocumentManagement, Version=14.0.0.0, Culture=neutral, PublicKeyToken=71e9bce111e9429c</Assembly>
-    <Class>Microsoft.Office.DocumentManagement.Internal.DocIdHandler</Class>
-    <Data/>
-    <Filter/>
-  </Receiver>
-</spe:Receivers>
+<FormTemplates xmlns="http://schemas.microsoft.com/sharepoint/v3/contenttype/forms">
+  <Display>DocumentLibraryForm</Display>
+  <Edit>DocumentLibraryForm</Edit>
+  <New>DocumentLibraryForm</New>
+</FormTemplates>
 </file>
 
-<file path=customXml/item4.xml><?xml version="1.0" encoding="utf-8"?>
-<b:Sources xmlns:b="http://schemas.openxmlformats.org/officeDocument/2006/bibliography" xmlns="http://schemas.openxmlformats.org/officeDocument/2006/bibliography" SelectedStyle="\APA.XSL" StyleName="APA"/>
-</file>
-
-<file path=customXml/item5.xml><?xml version="1.0" encoding="utf-8"?>
+<file path=customXml/item3.xml><?xml version="1.0" encoding="utf-8"?>
 <ct:contentTypeSchema xmlns:ct="http://schemas.microsoft.com/office/2006/metadata/contentType" xmlns:ma="http://schemas.microsoft.com/office/2006/metadata/properties/metaAttributes" ct:_="" ma:_="" ma:contentTypeName="Document" ma:contentTypeID="0x0101005C502226ABD20E419776EC59F13549DD" ma:contentTypeVersion="4" ma:contentTypeDescription="Create a new document." ma:contentTypeScope="" ma:versionID="6889fd06cac4880bbace2dbc8d93587f">
   <xsd:schema xmlns:xsd="http://www.w3.org/2001/XMLSchema" xmlns:xs="http://www.w3.org/2001/XMLSchema" xmlns:p="http://schemas.microsoft.com/office/2006/metadata/properties" xmlns:ns2="ddd86614-e075-45fd-ad75-7be4b83b486d" targetNamespace="http://schemas.microsoft.com/office/2006/metadata/properties" ma:root="true" ma:fieldsID="0d5952d3730e44bb7b599fd25b7a60a4" ns2:_="">
     <xsd:import namespace="ddd86614-e075-45fd-ad75-7be4b83b486d"/>
@@ -7922,15 +7853,57 @@
 </ct:contentTypeSchema>
 </file>
 
-<file path=customXml/itemProps1.xml><?xml version="1.0" encoding="utf-8"?>
-<ds:datastoreItem xmlns:ds="http://schemas.openxmlformats.org/officeDocument/2006/customXml" ds:itemID="{8E05EF34-00C3-445C-85DA-F1DB0117F497}">
-  <ds:schemaRefs>
-    <ds:schemaRef ds:uri="http://schemas.microsoft.com/sharepoint/v3/contenttype/forms"/>
-  </ds:schemaRefs>
-</ds:datastoreItem>
+<file path=customXml/item4.xml><?xml version="1.0" encoding="utf-8"?>
+<b:Sources xmlns:b="http://schemas.openxmlformats.org/officeDocument/2006/bibliography" xmlns="http://schemas.openxmlformats.org/officeDocument/2006/bibliography" SelectedStyle="\APA.XSL" StyleName="APA"/>
 </file>
 
-<file path=customXml/itemProps2.xml><?xml version="1.0" encoding="utf-8"?>
+<file path=customXml/item5.xml><?xml version="1.0" encoding="utf-8"?>
+<?mso-contentType ?>
+<spe:Receivers xmlns:spe="http://schemas.microsoft.com/sharepoint/events">
+  <Receiver>
+    <Name>Document ID Generator</Name>
+    <Synchronization>Synchronous</Synchronization>
+    <Type>10001</Type>
+    <SequenceNumber>1000</SequenceNumber>
+    <Assembly>Microsoft.Office.DocumentManagement, Version=14.0.0.0, Culture=neutral, PublicKeyToken=71e9bce111e9429c</Assembly>
+    <Class>Microsoft.Office.DocumentManagement.Internal.DocIdHandler</Class>
+    <Data/>
+    <Filter/>
+  </Receiver>
+  <Receiver>
+    <Name>Document ID Generator</Name>
+    <Synchronization>Synchronous</Synchronization>
+    <Type>10002</Type>
+    <SequenceNumber>1001</SequenceNumber>
+    <Assembly>Microsoft.Office.DocumentManagement, Version=14.0.0.0, Culture=neutral, PublicKeyToken=71e9bce111e9429c</Assembly>
+    <Class>Microsoft.Office.DocumentManagement.Internal.DocIdHandler</Class>
+    <Data/>
+    <Filter/>
+  </Receiver>
+  <Receiver>
+    <Name>Document ID Generator</Name>
+    <Synchronization>Synchronous</Synchronization>
+    <Type>10004</Type>
+    <SequenceNumber>1002</SequenceNumber>
+    <Assembly>Microsoft.Office.DocumentManagement, Version=14.0.0.0, Culture=neutral, PublicKeyToken=71e9bce111e9429c</Assembly>
+    <Class>Microsoft.Office.DocumentManagement.Internal.DocIdHandler</Class>
+    <Data/>
+    <Filter/>
+  </Receiver>
+  <Receiver>
+    <Name>Document ID Generator</Name>
+    <Synchronization>Synchronous</Synchronization>
+    <Type>10006</Type>
+    <SequenceNumber>1003</SequenceNumber>
+    <Assembly>Microsoft.Office.DocumentManagement, Version=14.0.0.0, Culture=neutral, PublicKeyToken=71e9bce111e9429c</Assembly>
+    <Class>Microsoft.Office.DocumentManagement.Internal.DocIdHandler</Class>
+    <Data/>
+    <Filter/>
+  </Receiver>
+</spe:Receivers>
+</file>
+
+<file path=customXml/itemProps1.xml><?xml version="1.0" encoding="utf-8"?>
 <ds:datastoreItem xmlns:ds="http://schemas.openxmlformats.org/officeDocument/2006/customXml" ds:itemID="{6EE38350-9134-45CE-9A81-881B472B5096}">
   <ds:schemaRefs>
     <ds:schemaRef ds:uri="http://schemas.microsoft.com/office/infopath/2007/PartnerControls"/>
@@ -7946,23 +7919,15 @@
 </ds:datastoreItem>
 </file>
 
-<file path=customXml/itemProps3.xml><?xml version="1.0" encoding="utf-8"?>
-<ds:datastoreItem xmlns:ds="http://schemas.openxmlformats.org/officeDocument/2006/customXml" ds:itemID="{2690EBB6-9E48-419F-B2B9-D05E3D04DA46}">
+<file path=customXml/itemProps2.xml><?xml version="1.0" encoding="utf-8"?>
+<ds:datastoreItem xmlns:ds="http://schemas.openxmlformats.org/officeDocument/2006/customXml" ds:itemID="{8E05EF34-00C3-445C-85DA-F1DB0117F497}">
   <ds:schemaRefs>
-    <ds:schemaRef ds:uri="http://schemas.microsoft.com/sharepoint/events"/>
+    <ds:schemaRef ds:uri="http://schemas.microsoft.com/sharepoint/v3/contenttype/forms"/>
   </ds:schemaRefs>
 </ds:datastoreItem>
 </file>
 
-<file path=customXml/itemProps4.xml><?xml version="1.0" encoding="utf-8"?>
-<ds:datastoreItem xmlns:ds="http://schemas.openxmlformats.org/officeDocument/2006/customXml" ds:itemID="{6F78C9F1-F9EC-4C7A-AD57-4FE74BECF1CB}">
-  <ds:schemaRefs>
-    <ds:schemaRef ds:uri="http://schemas.openxmlformats.org/officeDocument/2006/bibliography"/>
-  </ds:schemaRefs>
-</ds:datastoreItem>
-</file>
-
-<file path=customXml/itemProps5.xml><?xml version="1.0" encoding="utf-8"?>
+<file path=customXml/itemProps3.xml><?xml version="1.0" encoding="utf-8"?>
 <ds:datastoreItem xmlns:ds="http://schemas.openxmlformats.org/officeDocument/2006/customXml" ds:itemID="{10721A11-0898-4E01-9D8A-3EB7DCBF4A0E}">
   <ds:schemaRefs>
     <ds:schemaRef ds:uri="http://schemas.microsoft.com/office/2006/metadata/contentType"/>
@@ -7978,4 +7943,20 @@
     <ds:schemaRef ds:uri="http://schemas.microsoft.com/internal/obd"/>
   </ds:schemaRefs>
 </ds:datastoreItem>
+</file>
+
+<file path=customXml/itemProps4.xml><?xml version="1.0" encoding="utf-8"?>
+<ds:datastoreItem xmlns:ds="http://schemas.openxmlformats.org/officeDocument/2006/customXml" ds:itemID="{6F78C9F1-F9EC-4C7A-AD57-4FE74BECF1CB}">
+  <ds:schemaRefs>
+    <ds:schemaRef ds:uri="http://schemas.openxmlformats.org/officeDocument/2006/bibliography"/>
+  </ds:schemaRefs>
+</ds:datastoreItem>
+</file>
+
+<file path=customXml/itemProps5.xml><?xml version="1.0" encoding="utf-8"?>
+<ds:datastoreItem xmlns:ds="http://schemas.openxmlformats.org/officeDocument/2006/customXml" ds:itemID="{2690EBB6-9E48-419F-B2B9-D05E3D04DA46}">
+  <ds:schemaRefs>
+    <ds:schemaRef ds:uri="http://schemas.microsoft.com/sharepoint/events"/>
+  </ds:schemaRefs>
+</ds:datastoreItem>
 </file>
</xml_diff>